<commit_message>
fix(thue-cpc): sửa file Word "corrupt" (ảnh CMYK) + Mẫu A sang A4 ngang
- Nguyên nhân "The file is corrupt": letterhead nhúng là JPEG CMYK (4 kênh) làm
  Word báo unreadable. Convert sang sRGB PNG (scripts/assets/letterhead-hstc.png,
  qua sharp) + ImageRun type:'png'.
- Mẫu A (đơn máy): Portrait -> A4 NGANG, cột rộng hơn, data 12pt.
- Sửa cách set khổ: docx lib tự hoán w/h khi landscape -> truyền kích thước dọc.
  Mẫu A = A4 ngang (16838x11906); Mẫu B = A3 ngang thật (23811x16838, trước bị
  set nhầm thành A4).

Co-Authored-By: Claude Opus 4.8 <noreply@anthropic.com>
</commit_message>
<xml_diff>
--- a/src/lib/report/bang-ke-da-may.docx
+++ b/src/lib/report/bang-ke-da-may.docx
@@ -2573,7 +2573,7 @@
     </w:p>
     <w:tbl>
       <w:tblPr>
-        <w:tblW w:type="dxa" w:w="10960"/>
+        <w:tblW w:type="dxa" w:w="15900"/>
         <w:tblBorders>
           <w:top w:val="none"/>
           <w:left w:val="none"/>
@@ -2585,8 +2585,8 @@
         <w:tblLayout w:type="fixed"/>
       </w:tblPr>
       <w:tblGrid>
-        <w:gridCol w:w="5480"/>
-        <w:gridCol w:w="5480"/>
+        <w:gridCol w:w="7950"/>
+        <w:gridCol w:w="7950"/>
       </w:tblGrid>
       <w:tr>
         <w:tc>
@@ -2657,7 +2657,7 @@
       </w:r>
     </w:p>
     <w:sectPr>
-      <w:pgSz w:w="11906" w:h="16838" w:orient="landscape"/>
+      <w:pgSz w:w="23811" w:h="16838" w:orient="landscape"/>
       <w:pgMar w:top="500" w:right="500" w:bottom="500" w:left="500" w:header="708" w:footer="708" w:gutter="0"/>
       <w:pgNumType/>
       <w:docGrid w:linePitch="360"/>

</xml_diff>

<commit_message>
feat(thue-cpc): tinh chỉnh UI/bảng kê theo góp ý
- Đơn giá HĐ & Nhập counter: hiện vị trí đặt máy dưới tên khách (chữ nhỏ)
- Nhập counter: thêm ô tìm fuzzy (bỏ dấu), ô số nhập định dạng #.### (NumInput)
- Hợp đồng khung: phí cơ bản định dạng #.###
- Bảng kê: ô chọn khách hàng/HĐ khung thành combobox tìm kiếm (SearchSelect)
- Xuất Word: giá trị = 0 để TRỐNG (máy chỉ có đen trắng không in "0" ở cột màu)
- Mẫu đơn máy: Tổng sau VAT in đậm; dòng ngày lập format nghiêng, chỉ
  "Hà Nội, ngày dd tháng mm năm yyyy" (bỏ tên công ty ở dòng này)

Co-Authored-By: Claude Opus 4.8 <noreply@anthropic.com>
</commit_message>
<xml_diff>
--- a/src/lib/report/bang-ke-da-may.docx
+++ b/src/lib/report/bang-ke-da-may.docx
@@ -2557,14 +2557,8 @@
       <w:r>
         <w:rPr>
           <w:rFonts w:ascii="Times New Roman" w:cs="Times New Roman" w:eastAsia="Times New Roman" w:hAnsi="Times New Roman"/>
-          <w:sz w:val="24"/>
-          <w:szCs w:val="24"/>
-        </w:rPr>
-        <w:t xml:space="preserve">{{TEN_CONG_TY}}, </w:t>
-      </w:r>
-      <w:r>
-        <w:rPr>
-          <w:rFonts w:ascii="Times New Roman" w:cs="Times New Roman" w:eastAsia="Times New Roman" w:hAnsi="Times New Roman"/>
+          <w:i/>
+          <w:iCs/>
           <w:sz w:val="24"/>
           <w:szCs w:val="24"/>
         </w:rPr>

</xml_diff>

<commit_message>
feat(thue-cpc): bảng kê Word — giãn dòng 1.5, điền ô NGÀY đầu/cuối kỳ, Bằng chữ căn phải
- Phần chữ info trên bảng: giãn dòng 1.5 (line=360) cho cả 2 mẫu.
- Ô NGÀY đầu/cuối kỳ:
  + Cuối tháng: đầu = ngày 1 tháng M, cuối = ngày cuối tháng M.
  + Giữa tháng D: đầu = D tháng M (chotSoDate kỳ trước), cuối = D tháng M+1.
  Tính trong route export (helper kyNgay), áp cho cả mẫu đơn máy và đa máy.
- Dòng "Bằng chữ" căn phải.

Co-Authored-By: Claude Opus 4.8 <noreply@anthropic.com>
</commit_message>
<xml_diff>
--- a/src/lib/report/bang-ke-da-may.docx
+++ b/src/lib/report/bang-ke-da-may.docx
@@ -66,7 +66,7 @@
     </w:p>
     <w:p>
       <w:pPr>
-        <w:spacing w:after="20" w:before="20"/>
+        <w:spacing w:after="20" w:before="20" w:line="360" w:lineRule="auto"/>
       </w:pPr>
       <w:r>
         <w:rPr>
@@ -89,7 +89,7 @@
     </w:p>
     <w:p>
       <w:pPr>
-        <w:spacing w:after="20"/>
+        <w:spacing w:after="20" w:line="360" w:lineRule="auto"/>
       </w:pPr>
       <w:r>
         <w:rPr>
@@ -112,7 +112,7 @@
     </w:p>
     <w:p>
       <w:pPr>
-        <w:spacing w:after="80"/>
+        <w:spacing w:after="80" w:line="360" w:lineRule="auto"/>
       </w:pPr>
       <w:r>
         <w:rPr>
@@ -2512,6 +2512,7 @@
     <w:p>
       <w:pPr>
         <w:spacing w:before="80"/>
+        <w:jc w:val="right"/>
       </w:pPr>
       <w:r>
         <w:rPr>

</xml_diff>

<commit_message>
feat(thue-cpc): bảng kê gộp (khung) 24 cột + tính ở cấp hợp đồng khung (mig 26)
- Migration 26: hợp đồng khung thêm đơn giá đen/màu, miễn phí đen/màu, card_reader
  (dùng chung mọi máy trong khung). Form Hợp đồng khung thêm 5 ô này.
- Công thức gộp (POST bang-ke): giá thuê = phí cơ bản + Σ phí thuê máy; tính phí =
  max(Σ dùng - miễn phí, 0); thành tiền BC = tính phí × đơn giá khung; tổng trước VAT
  = giá thuê + thành tiền BC + card reader, ×(1+VAT).
- Template Mẫu B dựng lại đúng file chuẩn: 24 cột A3, Times 11pt, header 3 tầng,
  giá trị cấp hợp đồng ở hàng "Cộng tổng", loop máy chỉ cột theo từng máy.
- Mẫu đơn máy giữ nguyên.

Lưu ý kỹ thuật: docxtemplater không gộp dọc động qua vòng lặp -> giá trị cấp hợp
đồng đặt ở hàng Cộng tổng (thay vì merge dọc suốt các dòng máy như file mẫu).

Co-Authored-By: Claude Opus 4.8 <noreply@anthropic.com>
</commit_message>
<xml_diff>
--- a/src/lib/report/bang-ke-da-may.docx
+++ b/src/lib/report/bang-ke-da-may.docx
@@ -171,7 +171,7 @@
     </w:p>
     <w:tbl>
       <w:tblPr>
-        <w:tblW w:type="dxa" w:w="21950"/>
+        <w:tblW w:type="dxa" w:w="22959"/>
         <w:tblBorders>
           <w:top w:val="single" w:color="000000" w:sz="4"/>
           <w:left w:val="single" w:color="000000" w:sz="4"/>
@@ -184,29 +184,29 @@
       </w:tblPr>
       <w:tblGrid>
         <w:gridCol w:w="400"/>
-        <w:gridCol w:w="1100"/>
-        <w:gridCol w:w="1400"/>
-        <w:gridCol w:w="1300"/>
-        <w:gridCol w:w="900"/>
-        <w:gridCol w:w="900"/>
-        <w:gridCol w:w="800"/>
-        <w:gridCol w:w="900"/>
-        <w:gridCol w:w="900"/>
-        <w:gridCol w:w="800"/>
+        <w:gridCol w:w="729"/>
+        <w:gridCol w:w="1276"/>
+        <w:gridCol w:w="1134"/>
+        <w:gridCol w:w="1134"/>
+        <w:gridCol w:w="992"/>
+        <w:gridCol w:w="851"/>
+        <w:gridCol w:w="1134"/>
+        <w:gridCol w:w="992"/>
+        <w:gridCol w:w="851"/>
+        <w:gridCol w:w="992"/>
+        <w:gridCol w:w="992"/>
+        <w:gridCol w:w="709"/>
+        <w:gridCol w:w="992"/>
+        <w:gridCol w:w="851"/>
         <w:gridCol w:w="850"/>
-        <w:gridCol w:w="750"/>
-        <w:gridCol w:w="800"/>
-        <w:gridCol w:w="700"/>
-        <w:gridCol w:w="800"/>
-        <w:gridCol w:w="700"/>
-        <w:gridCol w:w="800"/>
-        <w:gridCol w:w="800"/>
-        <w:gridCol w:w="900"/>
-        <w:gridCol w:w="950"/>
-        <w:gridCol w:w="900"/>
-        <w:gridCol w:w="1300"/>
-        <w:gridCol w:w="1000"/>
-        <w:gridCol w:w="1300"/>
+        <w:gridCol w:w="851"/>
+        <w:gridCol w:w="708"/>
+        <w:gridCol w:w="993"/>
+        <w:gridCol w:w="992"/>
+        <w:gridCol w:w="1134"/>
+        <w:gridCol w:w="1134"/>
+        <w:gridCol w:w="1134"/>
+        <w:gridCol w:w="1134"/>
       </w:tblGrid>
       <w:tr>
         <w:trPr>
@@ -331,6 +331,7 @@
         <w:tc>
           <w:tcPr>
             <w:gridSpan w:val="3"/>
+            <w:vMerge w:val="restart"/>
             <w:shd w:fill="D9E1F2" w:color="auto" w:val="clear"/>
             <w:tcMar>
               <w:top w:type="dxa" w:w="20"/>
@@ -360,6 +361,7 @@
         <w:tc>
           <w:tcPr>
             <w:gridSpan w:val="3"/>
+            <w:vMerge w:val="restart"/>
             <w:shd w:fill="D9E1F2" w:color="auto" w:val="clear"/>
             <w:tcMar>
               <w:top w:type="dxa" w:w="20"/>
@@ -388,7 +390,7 @@
         </w:tc>
         <w:tc>
           <w:tcPr>
-            <w:gridSpan w:val="2"/>
+            <w:gridSpan w:val="6"/>
             <w:shd w:fill="D9E1F2" w:color="auto" w:val="clear"/>
             <w:tcMar>
               <w:top w:type="dxa" w:w="20"/>
@@ -411,13 +413,14 @@
                 <w:sz w:val="18"/>
                 <w:szCs w:val="18"/>
               </w:rPr>
-              <w:t xml:space="preserve">Số bản chụp sử dụng</w:t>
+              <w:t xml:space="preserve">Chi tiết bản chụp</w:t>
             </w:r>
           </w:p>
         </w:tc>
         <w:tc>
           <w:tcPr>
             <w:gridSpan w:val="2"/>
+            <w:vMerge w:val="restart"/>
             <w:shd w:fill="D9E1F2" w:color="auto" w:val="clear"/>
             <w:tcMar>
               <w:top w:type="dxa" w:w="20"/>
@@ -440,13 +443,13 @@
                 <w:sz w:val="18"/>
                 <w:szCs w:val="18"/>
               </w:rPr>
-              <w:t xml:space="preserve">Số BC miễn phí</w:t>
-            </w:r>
-          </w:p>
-        </w:tc>
-        <w:tc>
-          <w:tcPr>
-            <w:gridSpan w:val="2"/>
+              <w:t xml:space="preserve">Đơn giá</w:t>
+            </w:r>
+          </w:p>
+        </w:tc>
+        <w:tc>
+          <w:tcPr>
+            <w:vMerge w:val="restart"/>
             <w:shd w:fill="D9E1F2" w:color="auto" w:val="clear"/>
             <w:tcMar>
               <w:top w:type="dxa" w:w="20"/>
@@ -469,71 +472,14 @@
                 <w:sz w:val="18"/>
                 <w:szCs w:val="18"/>
               </w:rPr>
-              <w:t xml:space="preserve">Số BC tính phí</w:t>
+              <w:t xml:space="preserve">Card reader</w:t>
             </w:r>
           </w:p>
         </w:tc>
         <w:tc>
           <w:tcPr>
             <w:gridSpan w:val="2"/>
-            <w:shd w:fill="D9E1F2" w:color="auto" w:val="clear"/>
-            <w:tcMar>
-              <w:top w:type="dxa" w:w="20"/>
-              <w:left w:type="dxa" w:w="40"/>
-              <w:bottom w:type="dxa" w:w="20"/>
-              <w:right w:type="dxa" w:w="40"/>
-            </w:tcMar>
-            <w:vAlign w:val="center"/>
-          </w:tcPr>
-          <w:p>
-            <w:pPr>
-              <w:spacing w:after="0" w:before="0"/>
-              <w:jc w:val="center"/>
-            </w:pPr>
-            <w:r>
-              <w:rPr>
-                <w:rFonts w:ascii="Times New Roman" w:cs="Times New Roman" w:eastAsia="Times New Roman" w:hAnsi="Times New Roman"/>
-                <w:b/>
-                <w:bCs/>
-                <w:sz w:val="18"/>
-                <w:szCs w:val="18"/>
-              </w:rPr>
-              <w:t xml:space="preserve">Đơn giá</w:t>
-            </w:r>
-          </w:p>
-        </w:tc>
-        <w:tc>
-          <w:tcPr>
             <w:vMerge w:val="restart"/>
-            <w:shd w:fill="D9E1F2" w:color="auto" w:val="clear"/>
-            <w:tcMar>
-              <w:top w:type="dxa" w:w="20"/>
-              <w:left w:type="dxa" w:w="40"/>
-              <w:bottom w:type="dxa" w:w="20"/>
-              <w:right w:type="dxa" w:w="40"/>
-            </w:tcMar>
-            <w:vAlign w:val="center"/>
-          </w:tcPr>
-          <w:p>
-            <w:pPr>
-              <w:spacing w:after="0" w:before="0"/>
-              <w:jc w:val="center"/>
-            </w:pPr>
-            <w:r>
-              <w:rPr>
-                <w:rFonts w:ascii="Times New Roman" w:cs="Times New Roman" w:eastAsia="Times New Roman" w:hAnsi="Times New Roman"/>
-                <w:b/>
-                <w:bCs/>
-                <w:sz w:val="18"/>
-                <w:szCs w:val="18"/>
-              </w:rPr>
-              <w:t xml:space="preserve">Card reader</w:t>
-            </w:r>
-          </w:p>
-        </w:tc>
-        <w:tc>
-          <w:tcPr>
-            <w:gridSpan w:val="2"/>
             <w:shd w:fill="D9E1F2" w:color="auto" w:val="clear"/>
             <w:tcMar>
               <w:top w:type="dxa" w:w="20"/>
@@ -754,6 +700,59 @@
         </w:tc>
         <w:tc>
           <w:tcPr>
+            <w:gridSpan w:val="3"/>
+            <w:vMerge w:val="continue"/>
+            <w:tcMar>
+              <w:top w:type="dxa" w:w="20"/>
+              <w:left w:type="dxa" w:w="40"/>
+              <w:bottom w:type="dxa" w:w="20"/>
+              <w:right w:type="dxa" w:w="40"/>
+            </w:tcMar>
+            <w:vAlign w:val="center"/>
+          </w:tcPr>
+          <w:p>
+            <w:pPr>
+              <w:spacing w:after="0" w:before="0"/>
+            </w:pPr>
+            <w:r>
+              <w:rPr>
+                <w:rFonts w:ascii="Times New Roman" w:cs="Times New Roman" w:eastAsia="Times New Roman" w:hAnsi="Times New Roman"/>
+                <w:sz w:val="24"/>
+                <w:szCs w:val="24"/>
+              </w:rPr>
+              <w:t xml:space="preserve"/>
+            </w:r>
+          </w:p>
+        </w:tc>
+        <w:tc>
+          <w:tcPr>
+            <w:gridSpan w:val="3"/>
+            <w:vMerge w:val="continue"/>
+            <w:tcMar>
+              <w:top w:type="dxa" w:w="20"/>
+              <w:left w:type="dxa" w:w="40"/>
+              <w:bottom w:type="dxa" w:w="20"/>
+              <w:right w:type="dxa" w:w="40"/>
+            </w:tcMar>
+            <w:vAlign w:val="center"/>
+          </w:tcPr>
+          <w:p>
+            <w:pPr>
+              <w:spacing w:after="0" w:before="0"/>
+            </w:pPr>
+            <w:r>
+              <w:rPr>
+                <w:rFonts w:ascii="Times New Roman" w:cs="Times New Roman" w:eastAsia="Times New Roman" w:hAnsi="Times New Roman"/>
+                <w:sz w:val="24"/>
+                <w:szCs w:val="24"/>
+              </w:rPr>
+              <w:t xml:space="preserve"/>
+            </w:r>
+          </w:p>
+        </w:tc>
+        <w:tc>
+          <w:tcPr>
+            <w:gridSpan w:val="2"/>
             <w:shd w:fill="D9E1F2" w:color="auto" w:val="clear"/>
             <w:tcMar>
               <w:top w:type="dxa" w:w="20"/>
@@ -776,12 +775,13 @@
                 <w:sz w:val="18"/>
                 <w:szCs w:val="18"/>
               </w:rPr>
-              <w:t xml:space="preserve">Ngày</w:t>
-            </w:r>
-          </w:p>
-        </w:tc>
-        <w:tc>
-          <w:tcPr>
+              <w:t xml:space="preserve">Số bản chụp sử dụng</w:t>
+            </w:r>
+          </w:p>
+        </w:tc>
+        <w:tc>
+          <w:tcPr>
+            <w:gridSpan w:val="2"/>
             <w:shd w:fill="D9E1F2" w:color="auto" w:val="clear"/>
             <w:tcMar>
               <w:top w:type="dxa" w:w="20"/>
@@ -804,12 +804,13 @@
                 <w:sz w:val="18"/>
                 <w:szCs w:val="18"/>
               </w:rPr>
-              <w:t xml:space="preserve">Đen trắng</w:t>
-            </w:r>
-          </w:p>
-        </w:tc>
-        <w:tc>
-          <w:tcPr>
+              <w:t xml:space="preserve">Số BC miễn phí</w:t>
+            </w:r>
+          </w:p>
+        </w:tc>
+        <w:tc>
+          <w:tcPr>
+            <w:gridSpan w:val="2"/>
             <w:shd w:fill="D9E1F2" w:color="auto" w:val="clear"/>
             <w:tcMar>
               <w:top w:type="dxa" w:w="20"/>
@@ -832,7 +833,264 @@
                 <w:sz w:val="18"/>
                 <w:szCs w:val="18"/>
               </w:rPr>
-              <w:t xml:space="preserve">Màu</w:t>
+              <w:t xml:space="preserve">Số BC tính phí</w:t>
+            </w:r>
+          </w:p>
+        </w:tc>
+        <w:tc>
+          <w:tcPr>
+            <w:gridSpan w:val="2"/>
+            <w:vMerge w:val="continue"/>
+            <w:tcMar>
+              <w:top w:type="dxa" w:w="20"/>
+              <w:left w:type="dxa" w:w="40"/>
+              <w:bottom w:type="dxa" w:w="20"/>
+              <w:right w:type="dxa" w:w="40"/>
+            </w:tcMar>
+            <w:vAlign w:val="center"/>
+          </w:tcPr>
+          <w:p>
+            <w:pPr>
+              <w:spacing w:after="0" w:before="0"/>
+            </w:pPr>
+            <w:r>
+              <w:rPr>
+                <w:rFonts w:ascii="Times New Roman" w:cs="Times New Roman" w:eastAsia="Times New Roman" w:hAnsi="Times New Roman"/>
+                <w:sz w:val="24"/>
+                <w:szCs w:val="24"/>
+              </w:rPr>
+              <w:t xml:space="preserve"/>
+            </w:r>
+          </w:p>
+        </w:tc>
+        <w:tc>
+          <w:tcPr>
+            <w:vMerge w:val="continue"/>
+            <w:tcMar>
+              <w:top w:type="dxa" w:w="20"/>
+              <w:left w:type="dxa" w:w="40"/>
+              <w:bottom w:type="dxa" w:w="20"/>
+              <w:right w:type="dxa" w:w="40"/>
+            </w:tcMar>
+            <w:vAlign w:val="center"/>
+          </w:tcPr>
+          <w:p>
+            <w:pPr>
+              <w:spacing w:after="0" w:before="0"/>
+            </w:pPr>
+            <w:r>
+              <w:rPr>
+                <w:rFonts w:ascii="Times New Roman" w:cs="Times New Roman" w:eastAsia="Times New Roman" w:hAnsi="Times New Roman"/>
+                <w:sz w:val="24"/>
+                <w:szCs w:val="24"/>
+              </w:rPr>
+              <w:t xml:space="preserve"/>
+            </w:r>
+          </w:p>
+        </w:tc>
+        <w:tc>
+          <w:tcPr>
+            <w:gridSpan w:val="2"/>
+            <w:vMerge w:val="continue"/>
+            <w:tcMar>
+              <w:top w:type="dxa" w:w="20"/>
+              <w:left w:type="dxa" w:w="40"/>
+              <w:bottom w:type="dxa" w:w="20"/>
+              <w:right w:type="dxa" w:w="40"/>
+            </w:tcMar>
+            <w:vAlign w:val="center"/>
+          </w:tcPr>
+          <w:p>
+            <w:pPr>
+              <w:spacing w:after="0" w:before="0"/>
+            </w:pPr>
+            <w:r>
+              <w:rPr>
+                <w:rFonts w:ascii="Times New Roman" w:cs="Times New Roman" w:eastAsia="Times New Roman" w:hAnsi="Times New Roman"/>
+                <w:sz w:val="24"/>
+                <w:szCs w:val="24"/>
+              </w:rPr>
+              <w:t xml:space="preserve"/>
+            </w:r>
+          </w:p>
+        </w:tc>
+        <w:tc>
+          <w:tcPr>
+            <w:vMerge w:val="continue"/>
+            <w:tcMar>
+              <w:top w:type="dxa" w:w="20"/>
+              <w:left w:type="dxa" w:w="40"/>
+              <w:bottom w:type="dxa" w:w="20"/>
+              <w:right w:type="dxa" w:w="40"/>
+            </w:tcMar>
+            <w:vAlign w:val="center"/>
+          </w:tcPr>
+          <w:p>
+            <w:pPr>
+              <w:spacing w:after="0" w:before="0"/>
+            </w:pPr>
+            <w:r>
+              <w:rPr>
+                <w:rFonts w:ascii="Times New Roman" w:cs="Times New Roman" w:eastAsia="Times New Roman" w:hAnsi="Times New Roman"/>
+                <w:sz w:val="24"/>
+                <w:szCs w:val="24"/>
+              </w:rPr>
+              <w:t xml:space="preserve"/>
+            </w:r>
+          </w:p>
+        </w:tc>
+        <w:tc>
+          <w:tcPr>
+            <w:vMerge w:val="continue"/>
+            <w:tcMar>
+              <w:top w:type="dxa" w:w="20"/>
+              <w:left w:type="dxa" w:w="40"/>
+              <w:bottom w:type="dxa" w:w="20"/>
+              <w:right w:type="dxa" w:w="40"/>
+            </w:tcMar>
+            <w:vAlign w:val="center"/>
+          </w:tcPr>
+          <w:p>
+            <w:pPr>
+              <w:spacing w:after="0" w:before="0"/>
+            </w:pPr>
+            <w:r>
+              <w:rPr>
+                <w:rFonts w:ascii="Times New Roman" w:cs="Times New Roman" w:eastAsia="Times New Roman" w:hAnsi="Times New Roman"/>
+                <w:sz w:val="24"/>
+                <w:szCs w:val="24"/>
+              </w:rPr>
+              <w:t xml:space="preserve"/>
+            </w:r>
+          </w:p>
+        </w:tc>
+        <w:tc>
+          <w:tcPr>
+            <w:vMerge w:val="continue"/>
+            <w:tcMar>
+              <w:top w:type="dxa" w:w="20"/>
+              <w:left w:type="dxa" w:w="40"/>
+              <w:bottom w:type="dxa" w:w="20"/>
+              <w:right w:type="dxa" w:w="40"/>
+            </w:tcMar>
+            <w:vAlign w:val="center"/>
+          </w:tcPr>
+          <w:p>
+            <w:pPr>
+              <w:spacing w:after="0" w:before="0"/>
+            </w:pPr>
+            <w:r>
+              <w:rPr>
+                <w:rFonts w:ascii="Times New Roman" w:cs="Times New Roman" w:eastAsia="Times New Roman" w:hAnsi="Times New Roman"/>
+                <w:sz w:val="24"/>
+                <w:szCs w:val="24"/>
+              </w:rPr>
+              <w:t xml:space="preserve"/>
+            </w:r>
+          </w:p>
+        </w:tc>
+      </w:tr>
+      <w:tr>
+        <w:trPr>
+          <w:tblHeader/>
+        </w:trPr>
+        <w:tc>
+          <w:tcPr>
+            <w:vMerge w:val="continue"/>
+            <w:tcMar>
+              <w:top w:type="dxa" w:w="20"/>
+              <w:left w:type="dxa" w:w="40"/>
+              <w:bottom w:type="dxa" w:w="20"/>
+              <w:right w:type="dxa" w:w="40"/>
+            </w:tcMar>
+            <w:vAlign w:val="center"/>
+          </w:tcPr>
+          <w:p>
+            <w:pPr>
+              <w:spacing w:after="0" w:before="0"/>
+            </w:pPr>
+            <w:r>
+              <w:rPr>
+                <w:rFonts w:ascii="Times New Roman" w:cs="Times New Roman" w:eastAsia="Times New Roman" w:hAnsi="Times New Roman"/>
+                <w:sz w:val="24"/>
+                <w:szCs w:val="24"/>
+              </w:rPr>
+              <w:t xml:space="preserve"/>
+            </w:r>
+          </w:p>
+        </w:tc>
+        <w:tc>
+          <w:tcPr>
+            <w:vMerge w:val="continue"/>
+            <w:tcMar>
+              <w:top w:type="dxa" w:w="20"/>
+              <w:left w:type="dxa" w:w="40"/>
+              <w:bottom w:type="dxa" w:w="20"/>
+              <w:right w:type="dxa" w:w="40"/>
+            </w:tcMar>
+            <w:vAlign w:val="center"/>
+          </w:tcPr>
+          <w:p>
+            <w:pPr>
+              <w:spacing w:after="0" w:before="0"/>
+            </w:pPr>
+            <w:r>
+              <w:rPr>
+                <w:rFonts w:ascii="Times New Roman" w:cs="Times New Roman" w:eastAsia="Times New Roman" w:hAnsi="Times New Roman"/>
+                <w:sz w:val="24"/>
+                <w:szCs w:val="24"/>
+              </w:rPr>
+              <w:t xml:space="preserve"/>
+            </w:r>
+          </w:p>
+        </w:tc>
+        <w:tc>
+          <w:tcPr>
+            <w:vMerge w:val="continue"/>
+            <w:tcMar>
+              <w:top w:type="dxa" w:w="20"/>
+              <w:left w:type="dxa" w:w="40"/>
+              <w:bottom w:type="dxa" w:w="20"/>
+              <w:right w:type="dxa" w:w="40"/>
+            </w:tcMar>
+            <w:vAlign w:val="center"/>
+          </w:tcPr>
+          <w:p>
+            <w:pPr>
+              <w:spacing w:after="0" w:before="0"/>
+            </w:pPr>
+            <w:r>
+              <w:rPr>
+                <w:rFonts w:ascii="Times New Roman" w:cs="Times New Roman" w:eastAsia="Times New Roman" w:hAnsi="Times New Roman"/>
+                <w:sz w:val="24"/>
+                <w:szCs w:val="24"/>
+              </w:rPr>
+              <w:t xml:space="preserve"/>
+            </w:r>
+          </w:p>
+        </w:tc>
+        <w:tc>
+          <w:tcPr>
+            <w:vMerge w:val="continue"/>
+            <w:tcMar>
+              <w:top w:type="dxa" w:w="20"/>
+              <w:left w:type="dxa" w:w="40"/>
+              <w:bottom w:type="dxa" w:w="20"/>
+              <w:right w:type="dxa" w:w="40"/>
+            </w:tcMar>
+            <w:vAlign w:val="center"/>
+          </w:tcPr>
+          <w:p>
+            <w:pPr>
+              <w:spacing w:after="0" w:before="0"/>
+            </w:pPr>
+            <w:r>
+              <w:rPr>
+                <w:rFonts w:ascii="Times New Roman" w:cs="Times New Roman" w:eastAsia="Times New Roman" w:hAnsi="Times New Roman"/>
+                <w:sz w:val="24"/>
+                <w:szCs w:val="24"/>
+              </w:rPr>
+              <w:t xml:space="preserve"/>
             </w:r>
           </w:p>
         </w:tc>
@@ -944,7 +1202,7 @@
                 <w:sz w:val="18"/>
                 <w:szCs w:val="18"/>
               </w:rPr>
-              <w:t xml:space="preserve">Đen trắng</w:t>
+              <w:t xml:space="preserve">Ngày</w:t>
             </w:r>
           </w:p>
         </w:tc>
@@ -972,7 +1230,7 @@
                 <w:sz w:val="18"/>
                 <w:szCs w:val="18"/>
               </w:rPr>
-              <w:t xml:space="preserve">Màu</w:t>
+              <w:t xml:space="preserve">Đen trắng</w:t>
             </w:r>
           </w:p>
         </w:tc>
@@ -1000,7 +1258,7 @@
                 <w:sz w:val="18"/>
                 <w:szCs w:val="18"/>
               </w:rPr>
-              <w:t xml:space="preserve">Đen trắng</w:t>
+              <w:t xml:space="preserve">Màu</w:t>
             </w:r>
           </w:p>
         </w:tc>
@@ -1028,7 +1286,7 @@
                 <w:sz w:val="18"/>
                 <w:szCs w:val="18"/>
               </w:rPr>
-              <w:t xml:space="preserve">Màu</w:t>
+              <w:t xml:space="preserve">Đen trắng</w:t>
             </w:r>
           </w:p>
         </w:tc>
@@ -1056,7 +1314,7 @@
                 <w:sz w:val="18"/>
                 <w:szCs w:val="18"/>
               </w:rPr>
-              <w:t xml:space="preserve">Đen trắng</w:t>
+              <w:t xml:space="preserve">Màu</w:t>
             </w:r>
           </w:p>
         </w:tc>
@@ -1084,7 +1342,7 @@
                 <w:sz w:val="18"/>
                 <w:szCs w:val="18"/>
               </w:rPr>
-              <w:t xml:space="preserve">Màu</w:t>
+              <w:t xml:space="preserve">Đen trắng</w:t>
             </w:r>
           </w:p>
         </w:tc>
@@ -1112,7 +1370,7 @@
                 <w:sz w:val="18"/>
                 <w:szCs w:val="18"/>
               </w:rPr>
-              <w:t xml:space="preserve">Đen trắng</w:t>
+              <w:t xml:space="preserve">Màu</w:t>
             </w:r>
           </w:p>
         </w:tc>
@@ -1140,6 +1398,90 @@
                 <w:sz w:val="18"/>
                 <w:szCs w:val="18"/>
               </w:rPr>
+              <w:t xml:space="preserve">Đen trắng</w:t>
+            </w:r>
+          </w:p>
+        </w:tc>
+        <w:tc>
+          <w:tcPr>
+            <w:shd w:fill="D9E1F2" w:color="auto" w:val="clear"/>
+            <w:tcMar>
+              <w:top w:type="dxa" w:w="20"/>
+              <w:left w:type="dxa" w:w="40"/>
+              <w:bottom w:type="dxa" w:w="20"/>
+              <w:right w:type="dxa" w:w="40"/>
+            </w:tcMar>
+            <w:vAlign w:val="center"/>
+          </w:tcPr>
+          <w:p>
+            <w:pPr>
+              <w:spacing w:after="0" w:before="0"/>
+              <w:jc w:val="center"/>
+            </w:pPr>
+            <w:r>
+              <w:rPr>
+                <w:rFonts w:ascii="Times New Roman" w:cs="Times New Roman" w:eastAsia="Times New Roman" w:hAnsi="Times New Roman"/>
+                <w:b/>
+                <w:bCs/>
+                <w:sz w:val="18"/>
+                <w:szCs w:val="18"/>
+              </w:rPr>
+              <w:t xml:space="preserve">Màu</w:t>
+            </w:r>
+          </w:p>
+        </w:tc>
+        <w:tc>
+          <w:tcPr>
+            <w:shd w:fill="D9E1F2" w:color="auto" w:val="clear"/>
+            <w:tcMar>
+              <w:top w:type="dxa" w:w="20"/>
+              <w:left w:type="dxa" w:w="40"/>
+              <w:bottom w:type="dxa" w:w="20"/>
+              <w:right w:type="dxa" w:w="40"/>
+            </w:tcMar>
+            <w:vAlign w:val="center"/>
+          </w:tcPr>
+          <w:p>
+            <w:pPr>
+              <w:spacing w:after="0" w:before="0"/>
+              <w:jc w:val="center"/>
+            </w:pPr>
+            <w:r>
+              <w:rPr>
+                <w:rFonts w:ascii="Times New Roman" w:cs="Times New Roman" w:eastAsia="Times New Roman" w:hAnsi="Times New Roman"/>
+                <w:b/>
+                <w:bCs/>
+                <w:sz w:val="18"/>
+                <w:szCs w:val="18"/>
+              </w:rPr>
+              <w:t xml:space="preserve">Đen trắng</w:t>
+            </w:r>
+          </w:p>
+        </w:tc>
+        <w:tc>
+          <w:tcPr>
+            <w:shd w:fill="D9E1F2" w:color="auto" w:val="clear"/>
+            <w:tcMar>
+              <w:top w:type="dxa" w:w="20"/>
+              <w:left w:type="dxa" w:w="40"/>
+              <w:bottom w:type="dxa" w:w="20"/>
+              <w:right w:type="dxa" w:w="40"/>
+            </w:tcMar>
+            <w:vAlign w:val="center"/>
+          </w:tcPr>
+          <w:p>
+            <w:pPr>
+              <w:spacing w:after="0" w:before="0"/>
+              <w:jc w:val="center"/>
+            </w:pPr>
+            <w:r>
+              <w:rPr>
+                <w:rFonts w:ascii="Times New Roman" w:cs="Times New Roman" w:eastAsia="Times New Roman" w:hAnsi="Times New Roman"/>
+                <w:b/>
+                <w:bCs/>
+                <w:sz w:val="18"/>
+                <w:szCs w:val="18"/>
+              </w:rPr>
               <w:t xml:space="preserve">Màu</w:t>
             </w:r>
           </w:p>
@@ -1324,8 +1666,8 @@
                 <w:rFonts w:ascii="Times New Roman" w:cs="Times New Roman" w:eastAsia="Times New Roman" w:hAnsi="Times New Roman"/>
                 <w:b/>
                 <w:bCs/>
-                <w:sz w:val="20"/>
-                <w:szCs w:val="20"/>
+                <w:sz w:val="22"/>
+                <w:szCs w:val="22"/>
               </w:rPr>
               <w:t xml:space="preserve">Cộng tổng bản chụp tháng {{THANG}}/{{NAM}}</w:t>
             </w:r>
@@ -1352,10 +1694,10 @@
                 <w:rFonts w:ascii="Times New Roman" w:cs="Times New Roman" w:eastAsia="Times New Roman" w:hAnsi="Times New Roman"/>
                 <w:b/>
                 <w:bCs/>
-                <w:sz w:val="20"/>
-                <w:szCs w:val="20"/>
-              </w:rPr>
-              <w:t xml:space="preserve">{{GIA_THUE_CO_BAN}}</w:t>
+                <w:sz w:val="22"/>
+                <w:szCs w:val="22"/>
+              </w:rPr>
+              <w:t xml:space="preserve">{{GIA_THUE}}</w:t>
             </w:r>
           </w:p>
         </w:tc>
@@ -1530,8 +1872,8 @@
                 <w:rFonts w:ascii="Times New Roman" w:cs="Times New Roman" w:eastAsia="Times New Roman" w:hAnsi="Times New Roman"/>
                 <w:b/>
                 <w:bCs/>
-                <w:sz w:val="20"/>
-                <w:szCs w:val="20"/>
+                <w:sz w:val="22"/>
+                <w:szCs w:val="22"/>
               </w:rPr>
               <w:t xml:space="preserve">{{TONG_SD_DEN}}</w:t>
             </w:r>
@@ -1558,8 +1900,8 @@
                 <w:rFonts w:ascii="Times New Roman" w:cs="Times New Roman" w:eastAsia="Times New Roman" w:hAnsi="Times New Roman"/>
                 <w:b/>
                 <w:bCs/>
-                <w:sz w:val="20"/>
-                <w:szCs w:val="20"/>
+                <w:sz w:val="22"/>
+                <w:szCs w:val="22"/>
               </w:rPr>
               <w:t xml:space="preserve">{{TONG_SD_MAU}}</w:t>
             </w:r>
@@ -1579,14 +1921,17 @@
           <w:p>
             <w:pPr>
               <w:spacing w:after="0" w:before="0"/>
-            </w:pPr>
-            <w:r>
-              <w:rPr>
-                <w:rFonts w:ascii="Times New Roman" w:cs="Times New Roman" w:eastAsia="Times New Roman" w:hAnsi="Times New Roman"/>
-                <w:sz w:val="24"/>
-                <w:szCs w:val="24"/>
-              </w:rPr>
-              <w:t xml:space="preserve"/>
+              <w:jc w:val="right"/>
+            </w:pPr>
+            <w:r>
+              <w:rPr>
+                <w:rFonts w:ascii="Times New Roman" w:cs="Times New Roman" w:eastAsia="Times New Roman" w:hAnsi="Times New Roman"/>
+                <w:b/>
+                <w:bCs/>
+                <w:sz w:val="22"/>
+                <w:szCs w:val="22"/>
+              </w:rPr>
+              <w:t xml:space="preserve">{{MP_DEN}}</w:t>
             </w:r>
           </w:p>
         </w:tc>
@@ -1604,14 +1949,17 @@
           <w:p>
             <w:pPr>
               <w:spacing w:after="0" w:before="0"/>
-            </w:pPr>
-            <w:r>
-              <w:rPr>
-                <w:rFonts w:ascii="Times New Roman" w:cs="Times New Roman" w:eastAsia="Times New Roman" w:hAnsi="Times New Roman"/>
-                <w:sz w:val="24"/>
-                <w:szCs w:val="24"/>
-              </w:rPr>
-              <w:t xml:space="preserve"/>
+              <w:jc w:val="right"/>
+            </w:pPr>
+            <w:r>
+              <w:rPr>
+                <w:rFonts w:ascii="Times New Roman" w:cs="Times New Roman" w:eastAsia="Times New Roman" w:hAnsi="Times New Roman"/>
+                <w:b/>
+                <w:bCs/>
+                <w:sz w:val="22"/>
+                <w:szCs w:val="22"/>
+              </w:rPr>
+              <w:t xml:space="preserve">{{MP_MAU}}</w:t>
             </w:r>
           </w:p>
         </w:tc>
@@ -1636,10 +1984,10 @@
                 <w:rFonts w:ascii="Times New Roman" w:cs="Times New Roman" w:eastAsia="Times New Roman" w:hAnsi="Times New Roman"/>
                 <w:b/>
                 <w:bCs/>
-                <w:sz w:val="20"/>
-                <w:szCs w:val="20"/>
-              </w:rPr>
-              <w:t xml:space="preserve">{{TONG_TP_DEN}}</w:t>
+                <w:sz w:val="22"/>
+                <w:szCs w:val="22"/>
+              </w:rPr>
+              <w:t xml:space="preserve">{{TP_DEN}}</w:t>
             </w:r>
           </w:p>
         </w:tc>
@@ -1664,10 +2012,10 @@
                 <w:rFonts w:ascii="Times New Roman" w:cs="Times New Roman" w:eastAsia="Times New Roman" w:hAnsi="Times New Roman"/>
                 <w:b/>
                 <w:bCs/>
-                <w:sz w:val="20"/>
-                <w:szCs w:val="20"/>
-              </w:rPr>
-              <w:t xml:space="preserve">{{TONG_TP_MAU}}</w:t>
+                <w:sz w:val="22"/>
+                <w:szCs w:val="22"/>
+              </w:rPr>
+              <w:t xml:space="preserve">{{TP_MAU}}</w:t>
             </w:r>
           </w:p>
         </w:tc>
@@ -1685,14 +2033,17 @@
           <w:p>
             <w:pPr>
               <w:spacing w:after="0" w:before="0"/>
-            </w:pPr>
-            <w:r>
-              <w:rPr>
-                <w:rFonts w:ascii="Times New Roman" w:cs="Times New Roman" w:eastAsia="Times New Roman" w:hAnsi="Times New Roman"/>
-                <w:sz w:val="24"/>
-                <w:szCs w:val="24"/>
-              </w:rPr>
-              <w:t xml:space="preserve"/>
+              <w:jc w:val="right"/>
+            </w:pPr>
+            <w:r>
+              <w:rPr>
+                <w:rFonts w:ascii="Times New Roman" w:cs="Times New Roman" w:eastAsia="Times New Roman" w:hAnsi="Times New Roman"/>
+                <w:b/>
+                <w:bCs/>
+                <w:sz w:val="22"/>
+                <w:szCs w:val="22"/>
+              </w:rPr>
+              <w:t xml:space="preserve">{{DG_DEN}}</w:t>
             </w:r>
           </w:p>
         </w:tc>
@@ -1710,14 +2061,17 @@
           <w:p>
             <w:pPr>
               <w:spacing w:after="0" w:before="0"/>
-            </w:pPr>
-            <w:r>
-              <w:rPr>
-                <w:rFonts w:ascii="Times New Roman" w:cs="Times New Roman" w:eastAsia="Times New Roman" w:hAnsi="Times New Roman"/>
-                <w:sz w:val="24"/>
-                <w:szCs w:val="24"/>
-              </w:rPr>
-              <w:t xml:space="preserve"/>
+              <w:jc w:val="right"/>
+            </w:pPr>
+            <w:r>
+              <w:rPr>
+                <w:rFonts w:ascii="Times New Roman" w:cs="Times New Roman" w:eastAsia="Times New Roman" w:hAnsi="Times New Roman"/>
+                <w:b/>
+                <w:bCs/>
+                <w:sz w:val="22"/>
+                <w:szCs w:val="22"/>
+              </w:rPr>
+              <w:t xml:space="preserve">{{DG_MAU}}</w:t>
             </w:r>
           </w:p>
         </w:tc>
@@ -1742,10 +2096,10 @@
                 <w:rFonts w:ascii="Times New Roman" w:cs="Times New Roman" w:eastAsia="Times New Roman" w:hAnsi="Times New Roman"/>
                 <w:b/>
                 <w:bCs/>
-                <w:sz w:val="20"/>
-                <w:szCs w:val="20"/>
-              </w:rPr>
-              <w:t xml:space="preserve">{{TONG_CARD}}</w:t>
+                <w:sz w:val="22"/>
+                <w:szCs w:val="22"/>
+              </w:rPr>
+              <w:t xml:space="preserve">{{CARD}}</w:t>
             </w:r>
           </w:p>
         </w:tc>
@@ -1770,10 +2124,10 @@
                 <w:rFonts w:ascii="Times New Roman" w:cs="Times New Roman" w:eastAsia="Times New Roman" w:hAnsi="Times New Roman"/>
                 <w:b/>
                 <w:bCs/>
-                <w:sz w:val="20"/>
-                <w:szCs w:val="20"/>
-              </w:rPr>
-              <w:t xml:space="preserve">{{TONG_TT_DEN}}</w:t>
+                <w:sz w:val="22"/>
+                <w:szCs w:val="22"/>
+              </w:rPr>
+              <w:t xml:space="preserve">{{TT_DEN}}</w:t>
             </w:r>
           </w:p>
         </w:tc>
@@ -1798,10 +2152,10 @@
                 <w:rFonts w:ascii="Times New Roman" w:cs="Times New Roman" w:eastAsia="Times New Roman" w:hAnsi="Times New Roman"/>
                 <w:b/>
                 <w:bCs/>
-                <w:sz w:val="20"/>
-                <w:szCs w:val="20"/>
-              </w:rPr>
-              <w:t xml:space="preserve">{{TONG_TT_MAU}}</w:t>
+                <w:sz w:val="22"/>
+                <w:szCs w:val="22"/>
+              </w:rPr>
+              <w:t xml:space="preserve">{{TT_MAU}}</w:t>
             </w:r>
           </w:p>
         </w:tc>
@@ -1826,10 +2180,10 @@
                 <w:rFonts w:ascii="Times New Roman" w:cs="Times New Roman" w:eastAsia="Times New Roman" w:hAnsi="Times New Roman"/>
                 <w:b/>
                 <w:bCs/>
-                <w:sz w:val="20"/>
-                <w:szCs w:val="20"/>
-              </w:rPr>
-              <w:t xml:space="preserve">{{TONG_MAY_BC}}</w:t>
+                <w:sz w:val="22"/>
+                <w:szCs w:val="22"/>
+              </w:rPr>
+              <w:t xml:space="preserve">{{TT_MAY_BC}}</w:t>
             </w:r>
           </w:p>
         </w:tc>
@@ -1854,10 +2208,10 @@
                 <w:rFonts w:ascii="Times New Roman" w:cs="Times New Roman" w:eastAsia="Times New Roman" w:hAnsi="Times New Roman"/>
                 <w:b/>
                 <w:bCs/>
-                <w:sz w:val="20"/>
-                <w:szCs w:val="20"/>
-              </w:rPr>
-              <w:t xml:space="preserve">{{TONG_VAT}}</w:t>
+                <w:sz w:val="22"/>
+                <w:szCs w:val="22"/>
+              </w:rPr>
+              <w:t xml:space="preserve">{{VAT_TIEN}}</w:t>
             </w:r>
           </w:p>
         </w:tc>
@@ -1882,8 +2236,8 @@
                 <w:rFonts w:ascii="Times New Roman" w:cs="Times New Roman" w:eastAsia="Times New Roman" w:hAnsi="Times New Roman"/>
                 <w:b/>
                 <w:bCs/>
-                <w:sz w:val="20"/>
-                <w:szCs w:val="20"/>
+                <w:sz w:val="22"/>
+                <w:szCs w:val="22"/>
               </w:rPr>
               <w:t xml:space="preserve">{{TONG_CONG}}</w:t>
             </w:r>
@@ -1917,8 +2271,8 @@
             <w:r>
               <w:rPr>
                 <w:rFonts w:ascii="Times New Roman" w:cs="Times New Roman" w:eastAsia="Times New Roman" w:hAnsi="Times New Roman"/>
-                <w:sz w:val="20"/>
-                <w:szCs w:val="20"/>
+                <w:sz w:val="22"/>
+                <w:szCs w:val="22"/>
               </w:rPr>
               <w:t xml:space="preserve">{{stt}}</w:t>
             </w:r>
@@ -1942,8 +2296,8 @@
             <w:r>
               <w:rPr>
                 <w:rFonts w:ascii="Times New Roman" w:cs="Times New Roman" w:eastAsia="Times New Roman" w:hAnsi="Times New Roman"/>
-                <w:sz w:val="20"/>
-                <w:szCs w:val="20"/>
+                <w:sz w:val="22"/>
+                <w:szCs w:val="22"/>
               </w:rPr>
               <w:t xml:space="preserve">{{ma}}</w:t>
             </w:r>
@@ -1967,8 +2321,8 @@
             <w:r>
               <w:rPr>
                 <w:rFonts w:ascii="Times New Roman" w:cs="Times New Roman" w:eastAsia="Times New Roman" w:hAnsi="Times New Roman"/>
-                <w:sz w:val="20"/>
-                <w:szCs w:val="20"/>
+                <w:sz w:val="22"/>
+                <w:szCs w:val="22"/>
               </w:rPr>
               <w:t xml:space="preserve">{{ten}}</w:t>
             </w:r>
@@ -1987,40 +2341,64 @@
           <w:p>
             <w:pPr>
               <w:spacing w:after="0" w:before="0"/>
+            </w:pPr>
+            <w:r>
+              <w:rPr>
+                <w:rFonts w:ascii="Times New Roman" w:cs="Times New Roman" w:eastAsia="Times New Roman" w:hAnsi="Times New Roman"/>
+                <w:sz w:val="22"/>
+                <w:szCs w:val="22"/>
+              </w:rPr>
+              <w:t xml:space="preserve"/>
+            </w:r>
+          </w:p>
+        </w:tc>
+        <w:tc>
+          <w:tcPr>
+            <w:tcMar>
+              <w:top w:type="dxa" w:w="20"/>
+              <w:left w:type="dxa" w:w="40"/>
+              <w:bottom w:type="dxa" w:w="20"/>
+              <w:right w:type="dxa" w:w="40"/>
+            </w:tcMar>
+            <w:vAlign w:val="center"/>
+          </w:tcPr>
+          <w:p>
+            <w:pPr>
+              <w:spacing w:after="0" w:before="0"/>
+              <w:jc w:val="center"/>
+            </w:pPr>
+            <w:r>
+              <w:rPr>
+                <w:rFonts w:ascii="Times New Roman" w:cs="Times New Roman" w:eastAsia="Times New Roman" w:hAnsi="Times New Roman"/>
+                <w:sz w:val="22"/>
+                <w:szCs w:val="22"/>
+              </w:rPr>
+              <w:t xml:space="preserve">{{dk_ngay}}</w:t>
+            </w:r>
+          </w:p>
+        </w:tc>
+        <w:tc>
+          <w:tcPr>
+            <w:tcMar>
+              <w:top w:type="dxa" w:w="20"/>
+              <w:left w:type="dxa" w:w="40"/>
+              <w:bottom w:type="dxa" w:w="20"/>
+              <w:right w:type="dxa" w:w="40"/>
+            </w:tcMar>
+            <w:vAlign w:val="center"/>
+          </w:tcPr>
+          <w:p>
+            <w:pPr>
+              <w:spacing w:after="0" w:before="0"/>
               <w:jc w:val="right"/>
             </w:pPr>
             <w:r>
               <w:rPr>
                 <w:rFonts w:ascii="Times New Roman" w:cs="Times New Roman" w:eastAsia="Times New Roman" w:hAnsi="Times New Roman"/>
-                <w:sz w:val="20"/>
-                <w:szCs w:val="20"/>
-              </w:rPr>
-              <w:t xml:space="preserve">{{gia}}</w:t>
-            </w:r>
-          </w:p>
-        </w:tc>
-        <w:tc>
-          <w:tcPr>
-            <w:tcMar>
-              <w:top w:type="dxa" w:w="20"/>
-              <w:left w:type="dxa" w:w="40"/>
-              <w:bottom w:type="dxa" w:w="20"/>
-              <w:right w:type="dxa" w:w="40"/>
-            </w:tcMar>
-            <w:vAlign w:val="center"/>
-          </w:tcPr>
-          <w:p>
-            <w:pPr>
-              <w:spacing w:after="0" w:before="0"/>
-              <w:jc w:val="center"/>
-            </w:pPr>
-            <w:r>
-              <w:rPr>
-                <w:rFonts w:ascii="Times New Roman" w:cs="Times New Roman" w:eastAsia="Times New Roman" w:hAnsi="Times New Roman"/>
-                <w:sz w:val="20"/>
-                <w:szCs w:val="20"/>
-              </w:rPr>
-              <w:t xml:space="preserve">{{dk_ngay}}</w:t>
+                <w:sz w:val="22"/>
+                <w:szCs w:val="22"/>
+              </w:rPr>
+              <w:t xml:space="preserve">{{dk_den}}</w:t>
             </w:r>
           </w:p>
         </w:tc>
@@ -2042,10 +2420,35 @@
             <w:r>
               <w:rPr>
                 <w:rFonts w:ascii="Times New Roman" w:cs="Times New Roman" w:eastAsia="Times New Roman" w:hAnsi="Times New Roman"/>
-                <w:sz w:val="20"/>
-                <w:szCs w:val="20"/>
-              </w:rPr>
-              <w:t xml:space="preserve">{{dk_den}}</w:t>
+                <w:sz w:val="22"/>
+                <w:szCs w:val="22"/>
+              </w:rPr>
+              <w:t xml:space="preserve">{{dk_mau}}</w:t>
+            </w:r>
+          </w:p>
+        </w:tc>
+        <w:tc>
+          <w:tcPr>
+            <w:tcMar>
+              <w:top w:type="dxa" w:w="20"/>
+              <w:left w:type="dxa" w:w="40"/>
+              <w:bottom w:type="dxa" w:w="20"/>
+              <w:right w:type="dxa" w:w="40"/>
+            </w:tcMar>
+            <w:vAlign w:val="center"/>
+          </w:tcPr>
+          <w:p>
+            <w:pPr>
+              <w:spacing w:after="0" w:before="0"/>
+              <w:jc w:val="center"/>
+            </w:pPr>
+            <w:r>
+              <w:rPr>
+                <w:rFonts w:ascii="Times New Roman" w:cs="Times New Roman" w:eastAsia="Times New Roman" w:hAnsi="Times New Roman"/>
+                <w:sz w:val="22"/>
+                <w:szCs w:val="22"/>
+              </w:rPr>
+              <w:t xml:space="preserve">{{ck_ngay}}</w:t>
             </w:r>
           </w:p>
         </w:tc>
@@ -2067,35 +2470,10 @@
             <w:r>
               <w:rPr>
                 <w:rFonts w:ascii="Times New Roman" w:cs="Times New Roman" w:eastAsia="Times New Roman" w:hAnsi="Times New Roman"/>
-                <w:sz w:val="20"/>
-                <w:szCs w:val="20"/>
-              </w:rPr>
-              <w:t xml:space="preserve">{{dk_mau}}</w:t>
-            </w:r>
-          </w:p>
-        </w:tc>
-        <w:tc>
-          <w:tcPr>
-            <w:tcMar>
-              <w:top w:type="dxa" w:w="20"/>
-              <w:left w:type="dxa" w:w="40"/>
-              <w:bottom w:type="dxa" w:w="20"/>
-              <w:right w:type="dxa" w:w="40"/>
-            </w:tcMar>
-            <w:vAlign w:val="center"/>
-          </w:tcPr>
-          <w:p>
-            <w:pPr>
-              <w:spacing w:after="0" w:before="0"/>
-              <w:jc w:val="center"/>
-            </w:pPr>
-            <w:r>
-              <w:rPr>
-                <w:rFonts w:ascii="Times New Roman" w:cs="Times New Roman" w:eastAsia="Times New Roman" w:hAnsi="Times New Roman"/>
-                <w:sz w:val="20"/>
-                <w:szCs w:val="20"/>
-              </w:rPr>
-              <w:t xml:space="preserve">{{ck_ngay}}</w:t>
+                <w:sz w:val="22"/>
+                <w:szCs w:val="22"/>
+              </w:rPr>
+              <w:t xml:space="preserve">{{ck_den}}</w:t>
             </w:r>
           </w:p>
         </w:tc>
@@ -2117,10 +2495,10 @@
             <w:r>
               <w:rPr>
                 <w:rFonts w:ascii="Times New Roman" w:cs="Times New Roman" w:eastAsia="Times New Roman" w:hAnsi="Times New Roman"/>
-                <w:sz w:val="20"/>
-                <w:szCs w:val="20"/>
-              </w:rPr>
-              <w:t xml:space="preserve">{{ck_den}}</w:t>
+                <w:sz w:val="22"/>
+                <w:szCs w:val="22"/>
+              </w:rPr>
+              <w:t xml:space="preserve">{{ck_mau}}</w:t>
             </w:r>
           </w:p>
         </w:tc>
@@ -2142,10 +2520,10 @@
             <w:r>
               <w:rPr>
                 <w:rFonts w:ascii="Times New Roman" w:cs="Times New Roman" w:eastAsia="Times New Roman" w:hAnsi="Times New Roman"/>
-                <w:sz w:val="20"/>
-                <w:szCs w:val="20"/>
-              </w:rPr>
-              <w:t xml:space="preserve">{{ck_mau}}</w:t>
+                <w:sz w:val="22"/>
+                <w:szCs w:val="22"/>
+              </w:rPr>
+              <w:t xml:space="preserve">{{sd_den}}</w:t>
             </w:r>
           </w:p>
         </w:tc>
@@ -2167,33 +2545,8 @@
             <w:r>
               <w:rPr>
                 <w:rFonts w:ascii="Times New Roman" w:cs="Times New Roman" w:eastAsia="Times New Roman" w:hAnsi="Times New Roman"/>
-                <w:sz w:val="20"/>
-                <w:szCs w:val="20"/>
-              </w:rPr>
-              <w:t xml:space="preserve">{{sd_den}}</w:t>
-            </w:r>
-          </w:p>
-        </w:tc>
-        <w:tc>
-          <w:tcPr>
-            <w:tcMar>
-              <w:top w:type="dxa" w:w="20"/>
-              <w:left w:type="dxa" w:w="40"/>
-              <w:bottom w:type="dxa" w:w="20"/>
-              <w:right w:type="dxa" w:w="40"/>
-            </w:tcMar>
-            <w:vAlign w:val="center"/>
-          </w:tcPr>
-          <w:p>
-            <w:pPr>
-              <w:spacing w:after="0" w:before="0"/>
-              <w:jc w:val="right"/>
-            </w:pPr>
-            <w:r>
-              <w:rPr>
-                <w:rFonts w:ascii="Times New Roman" w:cs="Times New Roman" w:eastAsia="Times New Roman" w:hAnsi="Times New Roman"/>
-                <w:sz w:val="20"/>
-                <w:szCs w:val="20"/>
+                <w:sz w:val="22"/>
+                <w:szCs w:val="22"/>
               </w:rPr>
               <w:t xml:space="preserve">{{sd_mau}}</w:t>
             </w:r>
@@ -2212,290 +2565,279 @@
           <w:p>
             <w:pPr>
               <w:spacing w:after="0" w:before="0"/>
-              <w:jc w:val="right"/>
-            </w:pPr>
-            <w:r>
-              <w:rPr>
-                <w:rFonts w:ascii="Times New Roman" w:cs="Times New Roman" w:eastAsia="Times New Roman" w:hAnsi="Times New Roman"/>
-                <w:sz w:val="20"/>
-                <w:szCs w:val="20"/>
-              </w:rPr>
-              <w:t xml:space="preserve">{{mp_den}}</w:t>
-            </w:r>
-          </w:p>
-        </w:tc>
-        <w:tc>
-          <w:tcPr>
-            <w:tcMar>
-              <w:top w:type="dxa" w:w="20"/>
-              <w:left w:type="dxa" w:w="40"/>
-              <w:bottom w:type="dxa" w:w="20"/>
-              <w:right w:type="dxa" w:w="40"/>
-            </w:tcMar>
-            <w:vAlign w:val="center"/>
-          </w:tcPr>
-          <w:p>
-            <w:pPr>
-              <w:spacing w:after="0" w:before="0"/>
-              <w:jc w:val="right"/>
-            </w:pPr>
-            <w:r>
-              <w:rPr>
-                <w:rFonts w:ascii="Times New Roman" w:cs="Times New Roman" w:eastAsia="Times New Roman" w:hAnsi="Times New Roman"/>
-                <w:sz w:val="20"/>
-                <w:szCs w:val="20"/>
-              </w:rPr>
-              <w:t xml:space="preserve">{{mp_mau}}</w:t>
-            </w:r>
-          </w:p>
-        </w:tc>
-        <w:tc>
-          <w:tcPr>
-            <w:tcMar>
-              <w:top w:type="dxa" w:w="20"/>
-              <w:left w:type="dxa" w:w="40"/>
-              <w:bottom w:type="dxa" w:w="20"/>
-              <w:right w:type="dxa" w:w="40"/>
-            </w:tcMar>
-            <w:vAlign w:val="center"/>
-          </w:tcPr>
-          <w:p>
-            <w:pPr>
-              <w:spacing w:after="0" w:before="0"/>
-              <w:jc w:val="right"/>
-            </w:pPr>
-            <w:r>
-              <w:rPr>
-                <w:rFonts w:ascii="Times New Roman" w:cs="Times New Roman" w:eastAsia="Times New Roman" w:hAnsi="Times New Roman"/>
-                <w:sz w:val="20"/>
-                <w:szCs w:val="20"/>
-              </w:rPr>
-              <w:t xml:space="preserve">{{tp_den}}</w:t>
-            </w:r>
-          </w:p>
-        </w:tc>
-        <w:tc>
-          <w:tcPr>
-            <w:tcMar>
-              <w:top w:type="dxa" w:w="20"/>
-              <w:left w:type="dxa" w:w="40"/>
-              <w:bottom w:type="dxa" w:w="20"/>
-              <w:right w:type="dxa" w:w="40"/>
-            </w:tcMar>
-            <w:vAlign w:val="center"/>
-          </w:tcPr>
-          <w:p>
-            <w:pPr>
-              <w:spacing w:after="0" w:before="0"/>
-              <w:jc w:val="right"/>
-            </w:pPr>
-            <w:r>
-              <w:rPr>
-                <w:rFonts w:ascii="Times New Roman" w:cs="Times New Roman" w:eastAsia="Times New Roman" w:hAnsi="Times New Roman"/>
-                <w:sz w:val="20"/>
-                <w:szCs w:val="20"/>
-              </w:rPr>
-              <w:t xml:space="preserve">{{tp_mau}}</w:t>
-            </w:r>
-          </w:p>
-        </w:tc>
-        <w:tc>
-          <w:tcPr>
-            <w:tcMar>
-              <w:top w:type="dxa" w:w="20"/>
-              <w:left w:type="dxa" w:w="40"/>
-              <w:bottom w:type="dxa" w:w="20"/>
-              <w:right w:type="dxa" w:w="40"/>
-            </w:tcMar>
-            <w:vAlign w:val="center"/>
-          </w:tcPr>
-          <w:p>
-            <w:pPr>
-              <w:spacing w:after="0" w:before="0"/>
-              <w:jc w:val="right"/>
-            </w:pPr>
-            <w:r>
-              <w:rPr>
-                <w:rFonts w:ascii="Times New Roman" w:cs="Times New Roman" w:eastAsia="Times New Roman" w:hAnsi="Times New Roman"/>
-                <w:sz w:val="20"/>
-                <w:szCs w:val="20"/>
-              </w:rPr>
-              <w:t xml:space="preserve">{{dg_den}}</w:t>
-            </w:r>
-          </w:p>
-        </w:tc>
-        <w:tc>
-          <w:tcPr>
-            <w:tcMar>
-              <w:top w:type="dxa" w:w="20"/>
-              <w:left w:type="dxa" w:w="40"/>
-              <w:bottom w:type="dxa" w:w="20"/>
-              <w:right w:type="dxa" w:w="40"/>
-            </w:tcMar>
-            <w:vAlign w:val="center"/>
-          </w:tcPr>
-          <w:p>
-            <w:pPr>
-              <w:spacing w:after="0" w:before="0"/>
-              <w:jc w:val="right"/>
-            </w:pPr>
-            <w:r>
-              <w:rPr>
-                <w:rFonts w:ascii="Times New Roman" w:cs="Times New Roman" w:eastAsia="Times New Roman" w:hAnsi="Times New Roman"/>
-                <w:sz w:val="20"/>
-                <w:szCs w:val="20"/>
-              </w:rPr>
-              <w:t xml:space="preserve">{{dg_mau}}</w:t>
-            </w:r>
-          </w:p>
-        </w:tc>
-        <w:tc>
-          <w:tcPr>
-            <w:tcMar>
-              <w:top w:type="dxa" w:w="20"/>
-              <w:left w:type="dxa" w:w="40"/>
-              <w:bottom w:type="dxa" w:w="20"/>
-              <w:right w:type="dxa" w:w="40"/>
-            </w:tcMar>
-            <w:vAlign w:val="center"/>
-          </w:tcPr>
-          <w:p>
-            <w:pPr>
-              <w:spacing w:after="0" w:before="0"/>
-              <w:jc w:val="right"/>
-            </w:pPr>
-            <w:r>
-              <w:rPr>
-                <w:rFonts w:ascii="Times New Roman" w:cs="Times New Roman" w:eastAsia="Times New Roman" w:hAnsi="Times New Roman"/>
-                <w:sz w:val="20"/>
-                <w:szCs w:val="20"/>
-              </w:rPr>
-              <w:t xml:space="preserve">{{card}}</w:t>
-            </w:r>
-          </w:p>
-        </w:tc>
-        <w:tc>
-          <w:tcPr>
-            <w:tcMar>
-              <w:top w:type="dxa" w:w="20"/>
-              <w:left w:type="dxa" w:w="40"/>
-              <w:bottom w:type="dxa" w:w="20"/>
-              <w:right w:type="dxa" w:w="40"/>
-            </w:tcMar>
-            <w:vAlign w:val="center"/>
-          </w:tcPr>
-          <w:p>
-            <w:pPr>
-              <w:spacing w:after="0" w:before="0"/>
-              <w:jc w:val="right"/>
-            </w:pPr>
-            <w:r>
-              <w:rPr>
-                <w:rFonts w:ascii="Times New Roman" w:cs="Times New Roman" w:eastAsia="Times New Roman" w:hAnsi="Times New Roman"/>
-                <w:sz w:val="20"/>
-                <w:szCs w:val="20"/>
-              </w:rPr>
-              <w:t xml:space="preserve">{{tt_den}}</w:t>
-            </w:r>
-          </w:p>
-        </w:tc>
-        <w:tc>
-          <w:tcPr>
-            <w:tcMar>
-              <w:top w:type="dxa" w:w="20"/>
-              <w:left w:type="dxa" w:w="40"/>
-              <w:bottom w:type="dxa" w:w="20"/>
-              <w:right w:type="dxa" w:w="40"/>
-            </w:tcMar>
-            <w:vAlign w:val="center"/>
-          </w:tcPr>
-          <w:p>
-            <w:pPr>
-              <w:spacing w:after="0" w:before="0"/>
-              <w:jc w:val="right"/>
-            </w:pPr>
-            <w:r>
-              <w:rPr>
-                <w:rFonts w:ascii="Times New Roman" w:cs="Times New Roman" w:eastAsia="Times New Roman" w:hAnsi="Times New Roman"/>
-                <w:sz w:val="20"/>
-                <w:szCs w:val="20"/>
-              </w:rPr>
-              <w:t xml:space="preserve">{{tt_mau}}</w:t>
-            </w:r>
-          </w:p>
-        </w:tc>
-        <w:tc>
-          <w:tcPr>
-            <w:tcMar>
-              <w:top w:type="dxa" w:w="20"/>
-              <w:left w:type="dxa" w:w="40"/>
-              <w:bottom w:type="dxa" w:w="20"/>
-              <w:right w:type="dxa" w:w="40"/>
-            </w:tcMar>
-            <w:vAlign w:val="center"/>
-          </w:tcPr>
-          <w:p>
-            <w:pPr>
-              <w:spacing w:after="0" w:before="0"/>
-              <w:jc w:val="right"/>
-            </w:pPr>
-            <w:r>
-              <w:rPr>
-                <w:rFonts w:ascii="Times New Roman" w:cs="Times New Roman" w:eastAsia="Times New Roman" w:hAnsi="Times New Roman"/>
-                <w:sz w:val="20"/>
-                <w:szCs w:val="20"/>
-              </w:rPr>
-              <w:t xml:space="preserve">{{tt_may_bc}}</w:t>
-            </w:r>
-          </w:p>
-        </w:tc>
-        <w:tc>
-          <w:tcPr>
-            <w:tcMar>
-              <w:top w:type="dxa" w:w="20"/>
-              <w:left w:type="dxa" w:w="40"/>
-              <w:bottom w:type="dxa" w:w="20"/>
-              <w:right w:type="dxa" w:w="40"/>
-            </w:tcMar>
-            <w:vAlign w:val="center"/>
-          </w:tcPr>
-          <w:p>
-            <w:pPr>
-              <w:spacing w:after="0" w:before="0"/>
-              <w:jc w:val="right"/>
-            </w:pPr>
-            <w:r>
-              <w:rPr>
-                <w:rFonts w:ascii="Times New Roman" w:cs="Times New Roman" w:eastAsia="Times New Roman" w:hAnsi="Times New Roman"/>
-                <w:sz w:val="20"/>
-                <w:szCs w:val="20"/>
-              </w:rPr>
-              <w:t xml:space="preserve">{{vat_tien}}</w:t>
-            </w:r>
-          </w:p>
-        </w:tc>
-        <w:tc>
-          <w:tcPr>
-            <w:tcMar>
-              <w:top w:type="dxa" w:w="20"/>
-              <w:left w:type="dxa" w:w="40"/>
-              <w:bottom w:type="dxa" w:w="20"/>
-              <w:right w:type="dxa" w:w="40"/>
-            </w:tcMar>
-            <w:vAlign w:val="center"/>
-          </w:tcPr>
-          <w:p>
-            <w:pPr>
-              <w:spacing w:after="0" w:before="0"/>
-              <w:jc w:val="right"/>
-            </w:pPr>
-            <w:r>
-              <w:rPr>
-                <w:rFonts w:ascii="Times New Roman" w:cs="Times New Roman" w:eastAsia="Times New Roman" w:hAnsi="Times New Roman"/>
-                <w:sz w:val="20"/>
-                <w:szCs w:val="20"/>
-              </w:rPr>
-              <w:t xml:space="preserve">{{tong}}</w:t>
+            </w:pPr>
+            <w:r>
+              <w:rPr>
+                <w:rFonts w:ascii="Times New Roman" w:cs="Times New Roman" w:eastAsia="Times New Roman" w:hAnsi="Times New Roman"/>
+                <w:sz w:val="22"/>
+                <w:szCs w:val="22"/>
+              </w:rPr>
+              <w:t xml:space="preserve"/>
+            </w:r>
+          </w:p>
+        </w:tc>
+        <w:tc>
+          <w:tcPr>
+            <w:tcMar>
+              <w:top w:type="dxa" w:w="20"/>
+              <w:left w:type="dxa" w:w="40"/>
+              <w:bottom w:type="dxa" w:w="20"/>
+              <w:right w:type="dxa" w:w="40"/>
+            </w:tcMar>
+            <w:vAlign w:val="center"/>
+          </w:tcPr>
+          <w:p>
+            <w:pPr>
+              <w:spacing w:after="0" w:before="0"/>
+            </w:pPr>
+            <w:r>
+              <w:rPr>
+                <w:rFonts w:ascii="Times New Roman" w:cs="Times New Roman" w:eastAsia="Times New Roman" w:hAnsi="Times New Roman"/>
+                <w:sz w:val="22"/>
+                <w:szCs w:val="22"/>
+              </w:rPr>
+              <w:t xml:space="preserve"/>
+            </w:r>
+          </w:p>
+        </w:tc>
+        <w:tc>
+          <w:tcPr>
+            <w:tcMar>
+              <w:top w:type="dxa" w:w="20"/>
+              <w:left w:type="dxa" w:w="40"/>
+              <w:bottom w:type="dxa" w:w="20"/>
+              <w:right w:type="dxa" w:w="40"/>
+            </w:tcMar>
+            <w:vAlign w:val="center"/>
+          </w:tcPr>
+          <w:p>
+            <w:pPr>
+              <w:spacing w:after="0" w:before="0"/>
+            </w:pPr>
+            <w:r>
+              <w:rPr>
+                <w:rFonts w:ascii="Times New Roman" w:cs="Times New Roman" w:eastAsia="Times New Roman" w:hAnsi="Times New Roman"/>
+                <w:sz w:val="22"/>
+                <w:szCs w:val="22"/>
+              </w:rPr>
+              <w:t xml:space="preserve"/>
+            </w:r>
+          </w:p>
+        </w:tc>
+        <w:tc>
+          <w:tcPr>
+            <w:tcMar>
+              <w:top w:type="dxa" w:w="20"/>
+              <w:left w:type="dxa" w:w="40"/>
+              <w:bottom w:type="dxa" w:w="20"/>
+              <w:right w:type="dxa" w:w="40"/>
+            </w:tcMar>
+            <w:vAlign w:val="center"/>
+          </w:tcPr>
+          <w:p>
+            <w:pPr>
+              <w:spacing w:after="0" w:before="0"/>
+            </w:pPr>
+            <w:r>
+              <w:rPr>
+                <w:rFonts w:ascii="Times New Roman" w:cs="Times New Roman" w:eastAsia="Times New Roman" w:hAnsi="Times New Roman"/>
+                <w:sz w:val="22"/>
+                <w:szCs w:val="22"/>
+              </w:rPr>
+              <w:t xml:space="preserve"/>
+            </w:r>
+          </w:p>
+        </w:tc>
+        <w:tc>
+          <w:tcPr>
+            <w:tcMar>
+              <w:top w:type="dxa" w:w="20"/>
+              <w:left w:type="dxa" w:w="40"/>
+              <w:bottom w:type="dxa" w:w="20"/>
+              <w:right w:type="dxa" w:w="40"/>
+            </w:tcMar>
+            <w:vAlign w:val="center"/>
+          </w:tcPr>
+          <w:p>
+            <w:pPr>
+              <w:spacing w:after="0" w:before="0"/>
+            </w:pPr>
+            <w:r>
+              <w:rPr>
+                <w:rFonts w:ascii="Times New Roman" w:cs="Times New Roman" w:eastAsia="Times New Roman" w:hAnsi="Times New Roman"/>
+                <w:sz w:val="22"/>
+                <w:szCs w:val="22"/>
+              </w:rPr>
+              <w:t xml:space="preserve"/>
+            </w:r>
+          </w:p>
+        </w:tc>
+        <w:tc>
+          <w:tcPr>
+            <w:tcMar>
+              <w:top w:type="dxa" w:w="20"/>
+              <w:left w:type="dxa" w:w="40"/>
+              <w:bottom w:type="dxa" w:w="20"/>
+              <w:right w:type="dxa" w:w="40"/>
+            </w:tcMar>
+            <w:vAlign w:val="center"/>
+          </w:tcPr>
+          <w:p>
+            <w:pPr>
+              <w:spacing w:after="0" w:before="0"/>
+            </w:pPr>
+            <w:r>
+              <w:rPr>
+                <w:rFonts w:ascii="Times New Roman" w:cs="Times New Roman" w:eastAsia="Times New Roman" w:hAnsi="Times New Roman"/>
+                <w:sz w:val="22"/>
+                <w:szCs w:val="22"/>
+              </w:rPr>
+              <w:t xml:space="preserve"/>
+            </w:r>
+          </w:p>
+        </w:tc>
+        <w:tc>
+          <w:tcPr>
+            <w:tcMar>
+              <w:top w:type="dxa" w:w="20"/>
+              <w:left w:type="dxa" w:w="40"/>
+              <w:bottom w:type="dxa" w:w="20"/>
+              <w:right w:type="dxa" w:w="40"/>
+            </w:tcMar>
+            <w:vAlign w:val="center"/>
+          </w:tcPr>
+          <w:p>
+            <w:pPr>
+              <w:spacing w:after="0" w:before="0"/>
+            </w:pPr>
+            <w:r>
+              <w:rPr>
+                <w:rFonts w:ascii="Times New Roman" w:cs="Times New Roman" w:eastAsia="Times New Roman" w:hAnsi="Times New Roman"/>
+                <w:sz w:val="22"/>
+                <w:szCs w:val="22"/>
+              </w:rPr>
+              <w:t xml:space="preserve"/>
+            </w:r>
+          </w:p>
+        </w:tc>
+        <w:tc>
+          <w:tcPr>
+            <w:tcMar>
+              <w:top w:type="dxa" w:w="20"/>
+              <w:left w:type="dxa" w:w="40"/>
+              <w:bottom w:type="dxa" w:w="20"/>
+              <w:right w:type="dxa" w:w="40"/>
+            </w:tcMar>
+            <w:vAlign w:val="center"/>
+          </w:tcPr>
+          <w:p>
+            <w:pPr>
+              <w:spacing w:after="0" w:before="0"/>
+            </w:pPr>
+            <w:r>
+              <w:rPr>
+                <w:rFonts w:ascii="Times New Roman" w:cs="Times New Roman" w:eastAsia="Times New Roman" w:hAnsi="Times New Roman"/>
+                <w:sz w:val="22"/>
+                <w:szCs w:val="22"/>
+              </w:rPr>
+              <w:t xml:space="preserve"/>
+            </w:r>
+          </w:p>
+        </w:tc>
+        <w:tc>
+          <w:tcPr>
+            <w:tcMar>
+              <w:top w:type="dxa" w:w="20"/>
+              <w:left w:type="dxa" w:w="40"/>
+              <w:bottom w:type="dxa" w:w="20"/>
+              <w:right w:type="dxa" w:w="40"/>
+            </w:tcMar>
+            <w:vAlign w:val="center"/>
+          </w:tcPr>
+          <w:p>
+            <w:pPr>
+              <w:spacing w:after="0" w:before="0"/>
+            </w:pPr>
+            <w:r>
+              <w:rPr>
+                <w:rFonts w:ascii="Times New Roman" w:cs="Times New Roman" w:eastAsia="Times New Roman" w:hAnsi="Times New Roman"/>
+                <w:sz w:val="22"/>
+                <w:szCs w:val="22"/>
+              </w:rPr>
+              <w:t xml:space="preserve"/>
+            </w:r>
+          </w:p>
+        </w:tc>
+        <w:tc>
+          <w:tcPr>
+            <w:tcMar>
+              <w:top w:type="dxa" w:w="20"/>
+              <w:left w:type="dxa" w:w="40"/>
+              <w:bottom w:type="dxa" w:w="20"/>
+              <w:right w:type="dxa" w:w="40"/>
+            </w:tcMar>
+            <w:vAlign w:val="center"/>
+          </w:tcPr>
+          <w:p>
+            <w:pPr>
+              <w:spacing w:after="0" w:before="0"/>
+            </w:pPr>
+            <w:r>
+              <w:rPr>
+                <w:rFonts w:ascii="Times New Roman" w:cs="Times New Roman" w:eastAsia="Times New Roman" w:hAnsi="Times New Roman"/>
+                <w:sz w:val="22"/>
+                <w:szCs w:val="22"/>
+              </w:rPr>
+              <w:t xml:space="preserve"/>
+            </w:r>
+          </w:p>
+        </w:tc>
+        <w:tc>
+          <w:tcPr>
+            <w:tcMar>
+              <w:top w:type="dxa" w:w="20"/>
+              <w:left w:type="dxa" w:w="40"/>
+              <w:bottom w:type="dxa" w:w="20"/>
+              <w:right w:type="dxa" w:w="40"/>
+            </w:tcMar>
+            <w:vAlign w:val="center"/>
+          </w:tcPr>
+          <w:p>
+            <w:pPr>
+              <w:spacing w:after="0" w:before="0"/>
+            </w:pPr>
+            <w:r>
+              <w:rPr>
+                <w:rFonts w:ascii="Times New Roman" w:cs="Times New Roman" w:eastAsia="Times New Roman" w:hAnsi="Times New Roman"/>
+                <w:sz w:val="22"/>
+                <w:szCs w:val="22"/>
+              </w:rPr>
+              <w:t xml:space="preserve"/>
+            </w:r>
+          </w:p>
+        </w:tc>
+        <w:tc>
+          <w:tcPr>
+            <w:tcMar>
+              <w:top w:type="dxa" w:w="20"/>
+              <w:left w:type="dxa" w:w="40"/>
+              <w:bottom w:type="dxa" w:w="20"/>
+              <w:right w:type="dxa" w:w="40"/>
+            </w:tcMar>
+            <w:vAlign w:val="center"/>
+          </w:tcPr>
+          <w:p>
+            <w:pPr>
+              <w:spacing w:after="0" w:before="0"/>
+              <w:jc w:val="center"/>
+            </w:pPr>
+            <w:r>
+              <w:rPr>
+                <w:rFonts w:ascii="Times New Roman" w:cs="Times New Roman" w:eastAsia="Times New Roman" w:hAnsi="Times New Roman"/>
+                <w:sz w:val="22"/>
+                <w:szCs w:val="22"/>
+              </w:rPr>
+              <w:t xml:space="preserve"/>
             </w:r>
             <w:r>
               <w:rPr>

</xml_diff>

<commit_message>
chore(thue-cpc): Mẫu B — letterhead A3 + chân trang cân đối bằng bảng tính
- Nhúng letterhead A3 riêng (scripts/assets/letterhead-a3.png, RGB) cho mẫu đa máy.
- Bảng chữ ký rộng bằng bảng tính (A3); "Hà Nội, ngày..." đưa vào cột phải bảng
  chữ ký, canh giữa trên ĐẠI DIỆN CÔNG TY (bỏ dòng ngày lệch phải).
- twoColSign/logoImg tham số hóa; mẫu đơn máy giữ nguyên.

Co-Authored-By: Claude Opus 4.8 <noreply@anthropic.com>
</commit_message>
<xml_diff>
--- a/src/lib/report/bang-ke-da-may.docx
+++ b/src/lib/report/bang-ke-da-may.docx
@@ -10,7 +10,7 @@
       <w:r>
         <w:drawing>
           <wp:inline distT="0" distB="0" distL="0" distR="0">
-            <wp:extent cx="9525000" cy="428625"/>
+            <wp:extent cx="14287500" cy="371475"/>
             <wp:effectExtent t="0" r="0" b="0" l="0"/>
             <wp:docPr id="1" name="" descr="" title=""/>
             <wp:cNvGraphicFramePr>
@@ -35,7 +35,7 @@
                   <pic:spPr bwMode="auto">
                     <a:xfrm>
                       <a:off x="0" y="0"/>
-                      <a:ext cx="9525000" cy="428625"/>
+                      <a:ext cx="14287500" cy="371475"/>
                     </a:xfrm>
                     <a:prstGeom prst="rect">
                       <a:avLst/>
@@ -2894,23 +2894,20 @@
     </w:p>
     <w:p>
       <w:pPr>
-        <w:spacing w:before="160"/>
-        <w:jc w:val="right"/>
+        <w:spacing w:after="0" w:before="0"/>
       </w:pPr>
       <w:r>
         <w:rPr>
           <w:rFonts w:ascii="Times New Roman" w:cs="Times New Roman" w:eastAsia="Times New Roman" w:hAnsi="Times New Roman"/>
-          <w:i/>
-          <w:iCs/>
           <w:sz w:val="24"/>
           <w:szCs w:val="24"/>
         </w:rPr>
-        <w:t xml:space="preserve">{{NGAY_LAP_BANG_KE}}</w:t>
+        <w:t xml:space="preserve"/>
       </w:r>
     </w:p>
     <w:tbl>
       <w:tblPr>
-        <w:tblW w:type="dxa" w:w="15900"/>
+        <w:tblW w:type="dxa" w:w="22959"/>
         <w:tblBorders>
           <w:top w:val="none"/>
           <w:left w:val="none"/>
@@ -2922,8 +2919,8 @@
         <w:tblLayout w:type="fixed"/>
       </w:tblPr>
       <w:tblGrid>
-        <w:gridCol w:w="7950"/>
-        <w:gridCol w:w="7950"/>
+        <w:gridCol w:w="11480"/>
+        <w:gridCol w:w="11480"/>
       </w:tblGrid>
       <w:tr>
         <w:tc>
@@ -2937,7 +2934,21 @@
           </w:tcPr>
           <w:p>
             <w:pPr>
-              <w:spacing w:before="80"/>
+              <w:spacing w:after="0" w:before="0"/>
+              <w:jc w:val="center"/>
+            </w:pPr>
+            <w:r>
+              <w:rPr>
+                <w:rFonts w:ascii="Times New Roman" w:cs="Times New Roman" w:eastAsia="Times New Roman" w:hAnsi="Times New Roman"/>
+                <w:sz w:val="24"/>
+                <w:szCs w:val="24"/>
+              </w:rPr>
+              <w:t xml:space="preserve"/>
+            </w:r>
+          </w:p>
+          <w:p>
+            <w:pPr>
+              <w:spacing w:after="0" w:before="0"/>
               <w:jc w:val="center"/>
             </w:pPr>
             <w:r>
@@ -2963,7 +2974,23 @@
           </w:tcPr>
           <w:p>
             <w:pPr>
-              <w:spacing w:before="80"/>
+              <w:spacing w:after="0" w:before="0"/>
+              <w:jc w:val="center"/>
+            </w:pPr>
+            <w:r>
+              <w:rPr>
+                <w:rFonts w:ascii="Times New Roman" w:cs="Times New Roman" w:eastAsia="Times New Roman" w:hAnsi="Times New Roman"/>
+                <w:i/>
+                <w:iCs/>
+                <w:sz w:val="24"/>
+                <w:szCs w:val="24"/>
+              </w:rPr>
+              <w:t xml:space="preserve">{{NGAY_LAP_BANG_KE}}</w:t>
+            </w:r>
+          </w:p>
+          <w:p>
+            <w:pPr>
+              <w:spacing w:after="0" w:before="0"/>
               <w:jc w:val="center"/>
             </w:pPr>
             <w:r>

</xml_diff>